<commit_message>
Add waist, bone mass detail, and silhouette narrative to Elizabeth's improvement report
Added three waist comparison rows (abdominal -2.5in, narrowest
-3.5in, lower unchanged) and expanded the bone mass row with percent
detail (4.0% -> 4.0%, proportionally flat despite the lbs increase).
Added two narrative callouts: one on the waist/silhouette change
tying it to the ICONS aesthetic, and one explicitly distinguishing
Styku's Bone Mass estimate from a clinical DEXA bone-density scan so
the gain isn't overstated to the client.

Co-Authored-By: Claude Sonnet 5 <noreply@anthropic.com>
Claude-Session: https://claude.ai/code/session_01VTRA12TAy4P16NRVKS4SK5
</commit_message>
<xml_diff>
--- a/clients/elizabeth_poyner/Elizabeth_Poyner_Brace_Life_Improvement_Report.docx
+++ b/clients/elizabeth_poyner/Elizabeth_Poyner_Brace_Life_Improvement_Report.docx
@@ -915,7 +915,7 @@
                 <w:sz w:val="16"/>
                 <w:szCs w:val="16"/>
               </w:rPr>
-              <w:t xml:space="preserve">4.2 lbs</w:t>
+              <w:t xml:space="preserve">4.2 lbs (4.0%)</w:t>
             </w:r>
           </w:p>
         </w:tc>
@@ -950,7 +950,7 @@
                 <w:sz w:val="16"/>
                 <w:szCs w:val="16"/>
               </w:rPr>
-              <w:t xml:space="preserve">4.5 lbs</w:t>
+              <w:t xml:space="preserve">4.5 lbs (4.0%)</w:t>
             </w:r>
           </w:p>
         </w:tc>
@@ -1022,7 +1022,7 @@
                 <w:sz w:val="17"/>
                 <w:szCs w:val="17"/>
               </w:rPr>
-              <w:t xml:space="preserve">BMR</w:t>
+              <w:t xml:space="preserve">Waist (Abdominal)</w:t>
             </w:r>
           </w:p>
         </w:tc>
@@ -1057,7 +1057,7 @@
                 <w:sz w:val="16"/>
                 <w:szCs w:val="16"/>
               </w:rPr>
-              <w:t xml:space="preserve">1,122 cal/day</w:t>
+              <w:t xml:space="preserve">29.9 in</w:t>
             </w:r>
           </w:p>
         </w:tc>
@@ -1092,7 +1092,7 @@
                 <w:sz w:val="16"/>
                 <w:szCs w:val="16"/>
               </w:rPr>
-              <w:t xml:space="preserve">1,159 cal/day</w:t>
+              <w:t xml:space="preserve">27.4 in</w:t>
             </w:r>
           </w:p>
         </w:tc>
@@ -1127,7 +1127,7 @@
                 <w:sz w:val="16"/>
                 <w:szCs w:val="16"/>
               </w:rPr>
-              <w:t xml:space="preserve">+37 cal/day</w:t>
+              <w:t xml:space="preserve">−2.5 in</w:t>
             </w:r>
           </w:p>
         </w:tc>
@@ -1164,7 +1164,7 @@
                 <w:sz w:val="17"/>
                 <w:szCs w:val="17"/>
               </w:rPr>
-              <w:t xml:space="preserve">Body Fat Percentile</w:t>
+              <w:t xml:space="preserve">Waist (Narrowest)</w:t>
             </w:r>
           </w:p>
         </w:tc>
@@ -1199,7 +1199,7 @@
                 <w:sz w:val="16"/>
                 <w:szCs w:val="16"/>
               </w:rPr>
-              <w:t xml:space="preserve">Lower than 50% of peers</w:t>
+              <w:t xml:space="preserve">29.6 in</w:t>
             </w:r>
           </w:p>
         </w:tc>
@@ -1234,6 +1234,432 @@
                 <w:sz w:val="16"/>
                 <w:szCs w:val="16"/>
               </w:rPr>
+              <w:t xml:space="preserve">26.1 in</w:t>
+            </w:r>
+          </w:p>
+        </w:tc>
+        <w:tc>
+          <w:tcPr>
+            <w:tcW w:type="dxa" w:w="2440"/>
+            <w:tcBorders>
+              <w:top w:val="none" w:color="FFFFFF" w:sz="0"/>
+              <w:left w:val="none" w:color="FFFFFF" w:sz="0"/>
+              <w:bottom w:val="none" w:color="FFFFFF" w:sz="0"/>
+              <w:right w:val="none" w:color="FFFFFF" w:sz="0"/>
+            </w:tcBorders>
+            <w:shd w:fill="FAF3E0" w:color="auto" w:val="clear"/>
+            <w:tcMar>
+              <w:top w:type="dxa" w:w="40"/>
+              <w:left w:type="dxa" w:w="80"/>
+              <w:bottom w:type="dxa" w:w="40"/>
+              <w:right w:type="dxa" w:w="80"/>
+            </w:tcMar>
+            <w:vAlign w:val="center"/>
+          </w:tcPr>
+          <w:p>
+            <w:pPr>
+              <w:jc w:val="center"/>
+            </w:pPr>
+            <w:r>
+              <w:rPr>
+                <w:rFonts w:ascii="Arial" w:cs="Arial" w:eastAsia="Arial" w:hAnsi="Arial"/>
+                <w:b/>
+                <w:bCs/>
+                <w:color w:val="43A047"/>
+                <w:sz w:val="16"/>
+                <w:szCs w:val="16"/>
+              </w:rPr>
+              <w:t xml:space="preserve">−3.5 in</w:t>
+            </w:r>
+          </w:p>
+        </w:tc>
+      </w:tr>
+      <w:tr>
+        <w:tc>
+          <w:tcPr>
+            <w:tcW w:type="dxa" w:w="3200"/>
+            <w:tcBorders>
+              <w:top w:val="none" w:color="FFFFFF" w:sz="0"/>
+              <w:left w:val="none" w:color="FFFFFF" w:sz="0"/>
+              <w:bottom w:val="none" w:color="FFFFFF" w:sz="0"/>
+              <w:right w:val="none" w:color="FFFFFF" w:sz="0"/>
+            </w:tcBorders>
+            <w:shd w:fill="FFFFFF" w:color="auto" w:val="clear"/>
+            <w:tcMar>
+              <w:top w:type="dxa" w:w="40"/>
+              <w:left w:type="dxa" w:w="80"/>
+              <w:bottom w:type="dxa" w:w="40"/>
+              <w:right w:type="dxa" w:w="80"/>
+            </w:tcMar>
+            <w:vAlign w:val="center"/>
+          </w:tcPr>
+          <w:p>
+            <w:pPr>
+              <w:jc w:val="left"/>
+            </w:pPr>
+            <w:r>
+              <w:rPr>
+                <w:rFonts w:ascii="Arial" w:cs="Arial" w:eastAsia="Arial" w:hAnsi="Arial"/>
+                <w:b/>
+                <w:bCs/>
+                <w:color w:val="2C2C2C"/>
+                <w:sz w:val="17"/>
+                <w:szCs w:val="17"/>
+              </w:rPr>
+              <w:t xml:space="preserve">Waist (Lower)</w:t>
+            </w:r>
+          </w:p>
+        </w:tc>
+        <w:tc>
+          <w:tcPr>
+            <w:tcW w:type="dxa" w:w="2400"/>
+            <w:tcBorders>
+              <w:top w:val="none" w:color="FFFFFF" w:sz="0"/>
+              <w:left w:val="none" w:color="FFFFFF" w:sz="0"/>
+              <w:bottom w:val="none" w:color="FFFFFF" w:sz="0"/>
+              <w:right w:val="none" w:color="FFFFFF" w:sz="0"/>
+            </w:tcBorders>
+            <w:shd w:fill="FFFFFF" w:color="auto" w:val="clear"/>
+            <w:tcMar>
+              <w:top w:type="dxa" w:w="40"/>
+              <w:left w:type="dxa" w:w="80"/>
+              <w:bottom w:type="dxa" w:w="40"/>
+              <w:right w:type="dxa" w:w="80"/>
+            </w:tcMar>
+            <w:vAlign w:val="center"/>
+          </w:tcPr>
+          <w:p>
+            <w:pPr>
+              <w:jc w:val="center"/>
+            </w:pPr>
+            <w:r>
+              <w:rPr>
+                <w:rFonts w:ascii="Arial" w:cs="Arial" w:eastAsia="Arial" w:hAnsi="Arial"/>
+                <w:b w:val="false"/>
+                <w:bCs w:val="false"/>
+                <w:color w:val="6B6B6B"/>
+                <w:sz w:val="16"/>
+                <w:szCs w:val="16"/>
+              </w:rPr>
+              <w:t xml:space="preserve">29.4 in</w:t>
+            </w:r>
+          </w:p>
+        </w:tc>
+        <w:tc>
+          <w:tcPr>
+            <w:tcW w:type="dxa" w:w="2400"/>
+            <w:tcBorders>
+              <w:top w:val="none" w:color="FFFFFF" w:sz="0"/>
+              <w:left w:val="none" w:color="FFFFFF" w:sz="0"/>
+              <w:bottom w:val="none" w:color="FFFFFF" w:sz="0"/>
+              <w:right w:val="none" w:color="FFFFFF" w:sz="0"/>
+            </w:tcBorders>
+            <w:shd w:fill="FFFFFF" w:color="auto" w:val="clear"/>
+            <w:tcMar>
+              <w:top w:type="dxa" w:w="40"/>
+              <w:left w:type="dxa" w:w="80"/>
+              <w:bottom w:type="dxa" w:w="40"/>
+              <w:right w:type="dxa" w:w="80"/>
+            </w:tcMar>
+            <w:vAlign w:val="center"/>
+          </w:tcPr>
+          <w:p>
+            <w:pPr>
+              <w:jc w:val="center"/>
+            </w:pPr>
+            <w:r>
+              <w:rPr>
+                <w:rFonts w:ascii="Arial" w:cs="Arial" w:eastAsia="Arial" w:hAnsi="Arial"/>
+                <w:b w:val="false"/>
+                <w:bCs w:val="false"/>
+                <w:color w:val="6B6B6B"/>
+                <w:sz w:val="16"/>
+                <w:szCs w:val="16"/>
+              </w:rPr>
+              <w:t xml:space="preserve">29.4 in</w:t>
+            </w:r>
+          </w:p>
+        </w:tc>
+        <w:tc>
+          <w:tcPr>
+            <w:tcW w:type="dxa" w:w="2440"/>
+            <w:tcBorders>
+              <w:top w:val="none" w:color="FFFFFF" w:sz="0"/>
+              <w:left w:val="none" w:color="FFFFFF" w:sz="0"/>
+              <w:bottom w:val="none" w:color="FFFFFF" w:sz="0"/>
+              <w:right w:val="none" w:color="FFFFFF" w:sz="0"/>
+            </w:tcBorders>
+            <w:shd w:fill="FFFFFF" w:color="auto" w:val="clear"/>
+            <w:tcMar>
+              <w:top w:type="dxa" w:w="40"/>
+              <w:left w:type="dxa" w:w="80"/>
+              <w:bottom w:type="dxa" w:w="40"/>
+              <w:right w:type="dxa" w:w="80"/>
+            </w:tcMar>
+            <w:vAlign w:val="center"/>
+          </w:tcPr>
+          <w:p>
+            <w:pPr>
+              <w:jc w:val="center"/>
+            </w:pPr>
+            <w:r>
+              <w:rPr>
+                <w:rFonts w:ascii="Arial" w:cs="Arial" w:eastAsia="Arial" w:hAnsi="Arial"/>
+                <w:b/>
+                <w:bCs/>
+                <w:color w:val="43A047"/>
+                <w:sz w:val="16"/>
+                <w:szCs w:val="16"/>
+              </w:rPr>
+              <w:t xml:space="preserve">No change</w:t>
+            </w:r>
+          </w:p>
+        </w:tc>
+      </w:tr>
+      <w:tr>
+        <w:tc>
+          <w:tcPr>
+            <w:tcW w:type="dxa" w:w="3200"/>
+            <w:tcBorders>
+              <w:top w:val="none" w:color="FFFFFF" w:sz="0"/>
+              <w:left w:val="none" w:color="FFFFFF" w:sz="0"/>
+              <w:bottom w:val="none" w:color="FFFFFF" w:sz="0"/>
+              <w:right w:val="none" w:color="FFFFFF" w:sz="0"/>
+            </w:tcBorders>
+            <w:shd w:fill="FAF3E0" w:color="auto" w:val="clear"/>
+            <w:tcMar>
+              <w:top w:type="dxa" w:w="40"/>
+              <w:left w:type="dxa" w:w="80"/>
+              <w:bottom w:type="dxa" w:w="40"/>
+              <w:right w:type="dxa" w:w="80"/>
+            </w:tcMar>
+            <w:vAlign w:val="center"/>
+          </w:tcPr>
+          <w:p>
+            <w:pPr>
+              <w:jc w:val="left"/>
+            </w:pPr>
+            <w:r>
+              <w:rPr>
+                <w:rFonts w:ascii="Arial" w:cs="Arial" w:eastAsia="Arial" w:hAnsi="Arial"/>
+                <w:b/>
+                <w:bCs/>
+                <w:color w:val="2C2C2C"/>
+                <w:sz w:val="17"/>
+                <w:szCs w:val="17"/>
+              </w:rPr>
+              <w:t xml:space="preserve">BMR</w:t>
+            </w:r>
+          </w:p>
+        </w:tc>
+        <w:tc>
+          <w:tcPr>
+            <w:tcW w:type="dxa" w:w="2400"/>
+            <w:tcBorders>
+              <w:top w:val="none" w:color="FFFFFF" w:sz="0"/>
+              <w:left w:val="none" w:color="FFFFFF" w:sz="0"/>
+              <w:bottom w:val="none" w:color="FFFFFF" w:sz="0"/>
+              <w:right w:val="none" w:color="FFFFFF" w:sz="0"/>
+            </w:tcBorders>
+            <w:shd w:fill="FAF3E0" w:color="auto" w:val="clear"/>
+            <w:tcMar>
+              <w:top w:type="dxa" w:w="40"/>
+              <w:left w:type="dxa" w:w="80"/>
+              <w:bottom w:type="dxa" w:w="40"/>
+              <w:right w:type="dxa" w:w="80"/>
+            </w:tcMar>
+            <w:vAlign w:val="center"/>
+          </w:tcPr>
+          <w:p>
+            <w:pPr>
+              <w:jc w:val="center"/>
+            </w:pPr>
+            <w:r>
+              <w:rPr>
+                <w:rFonts w:ascii="Arial" w:cs="Arial" w:eastAsia="Arial" w:hAnsi="Arial"/>
+                <w:b w:val="false"/>
+                <w:bCs w:val="false"/>
+                <w:color w:val="6B6B6B"/>
+                <w:sz w:val="16"/>
+                <w:szCs w:val="16"/>
+              </w:rPr>
+              <w:t xml:space="preserve">1,122 cal/day</w:t>
+            </w:r>
+          </w:p>
+        </w:tc>
+        <w:tc>
+          <w:tcPr>
+            <w:tcW w:type="dxa" w:w="2400"/>
+            <w:tcBorders>
+              <w:top w:val="none" w:color="FFFFFF" w:sz="0"/>
+              <w:left w:val="none" w:color="FFFFFF" w:sz="0"/>
+              <w:bottom w:val="none" w:color="FFFFFF" w:sz="0"/>
+              <w:right w:val="none" w:color="FFFFFF" w:sz="0"/>
+            </w:tcBorders>
+            <w:shd w:fill="FAF3E0" w:color="auto" w:val="clear"/>
+            <w:tcMar>
+              <w:top w:type="dxa" w:w="40"/>
+              <w:left w:type="dxa" w:w="80"/>
+              <w:bottom w:type="dxa" w:w="40"/>
+              <w:right w:type="dxa" w:w="80"/>
+            </w:tcMar>
+            <w:vAlign w:val="center"/>
+          </w:tcPr>
+          <w:p>
+            <w:pPr>
+              <w:jc w:val="center"/>
+            </w:pPr>
+            <w:r>
+              <w:rPr>
+                <w:rFonts w:ascii="Arial" w:cs="Arial" w:eastAsia="Arial" w:hAnsi="Arial"/>
+                <w:b w:val="false"/>
+                <w:bCs w:val="false"/>
+                <w:color w:val="6B6B6B"/>
+                <w:sz w:val="16"/>
+                <w:szCs w:val="16"/>
+              </w:rPr>
+              <w:t xml:space="preserve">1,159 cal/day</w:t>
+            </w:r>
+          </w:p>
+        </w:tc>
+        <w:tc>
+          <w:tcPr>
+            <w:tcW w:type="dxa" w:w="2440"/>
+            <w:tcBorders>
+              <w:top w:val="none" w:color="FFFFFF" w:sz="0"/>
+              <w:left w:val="none" w:color="FFFFFF" w:sz="0"/>
+              <w:bottom w:val="none" w:color="FFFFFF" w:sz="0"/>
+              <w:right w:val="none" w:color="FFFFFF" w:sz="0"/>
+            </w:tcBorders>
+            <w:shd w:fill="FAF3E0" w:color="auto" w:val="clear"/>
+            <w:tcMar>
+              <w:top w:type="dxa" w:w="40"/>
+              <w:left w:type="dxa" w:w="80"/>
+              <w:bottom w:type="dxa" w:w="40"/>
+              <w:right w:type="dxa" w:w="80"/>
+            </w:tcMar>
+            <w:vAlign w:val="center"/>
+          </w:tcPr>
+          <w:p>
+            <w:pPr>
+              <w:jc w:val="center"/>
+            </w:pPr>
+            <w:r>
+              <w:rPr>
+                <w:rFonts w:ascii="Arial" w:cs="Arial" w:eastAsia="Arial" w:hAnsi="Arial"/>
+                <w:b/>
+                <w:bCs/>
+                <w:color w:val="43A047"/>
+                <w:sz w:val="16"/>
+                <w:szCs w:val="16"/>
+              </w:rPr>
+              <w:t xml:space="preserve">+37 cal/day</w:t>
+            </w:r>
+          </w:p>
+        </w:tc>
+      </w:tr>
+      <w:tr>
+        <w:tc>
+          <w:tcPr>
+            <w:tcW w:type="dxa" w:w="3200"/>
+            <w:tcBorders>
+              <w:top w:val="none" w:color="FFFFFF" w:sz="0"/>
+              <w:left w:val="none" w:color="FFFFFF" w:sz="0"/>
+              <w:bottom w:val="none" w:color="FFFFFF" w:sz="0"/>
+              <w:right w:val="none" w:color="FFFFFF" w:sz="0"/>
+            </w:tcBorders>
+            <w:shd w:fill="FFFFFF" w:color="auto" w:val="clear"/>
+            <w:tcMar>
+              <w:top w:type="dxa" w:w="40"/>
+              <w:left w:type="dxa" w:w="80"/>
+              <w:bottom w:type="dxa" w:w="40"/>
+              <w:right w:type="dxa" w:w="80"/>
+            </w:tcMar>
+            <w:vAlign w:val="center"/>
+          </w:tcPr>
+          <w:p>
+            <w:pPr>
+              <w:jc w:val="left"/>
+            </w:pPr>
+            <w:r>
+              <w:rPr>
+                <w:rFonts w:ascii="Arial" w:cs="Arial" w:eastAsia="Arial" w:hAnsi="Arial"/>
+                <w:b/>
+                <w:bCs/>
+                <w:color w:val="2C2C2C"/>
+                <w:sz w:val="17"/>
+                <w:szCs w:val="17"/>
+              </w:rPr>
+              <w:t xml:space="preserve">Body Fat Percentile</w:t>
+            </w:r>
+          </w:p>
+        </w:tc>
+        <w:tc>
+          <w:tcPr>
+            <w:tcW w:type="dxa" w:w="2400"/>
+            <w:tcBorders>
+              <w:top w:val="none" w:color="FFFFFF" w:sz="0"/>
+              <w:left w:val="none" w:color="FFFFFF" w:sz="0"/>
+              <w:bottom w:val="none" w:color="FFFFFF" w:sz="0"/>
+              <w:right w:val="none" w:color="FFFFFF" w:sz="0"/>
+            </w:tcBorders>
+            <w:shd w:fill="FFFFFF" w:color="auto" w:val="clear"/>
+            <w:tcMar>
+              <w:top w:type="dxa" w:w="40"/>
+              <w:left w:type="dxa" w:w="80"/>
+              <w:bottom w:type="dxa" w:w="40"/>
+              <w:right w:type="dxa" w:w="80"/>
+            </w:tcMar>
+            <w:vAlign w:val="center"/>
+          </w:tcPr>
+          <w:p>
+            <w:pPr>
+              <w:jc w:val="center"/>
+            </w:pPr>
+            <w:r>
+              <w:rPr>
+                <w:rFonts w:ascii="Arial" w:cs="Arial" w:eastAsia="Arial" w:hAnsi="Arial"/>
+                <w:b w:val="false"/>
+                <w:bCs w:val="false"/>
+                <w:color w:val="6B6B6B"/>
+                <w:sz w:val="16"/>
+                <w:szCs w:val="16"/>
+              </w:rPr>
+              <w:t xml:space="preserve">Lower than 50% of peers</w:t>
+            </w:r>
+          </w:p>
+        </w:tc>
+        <w:tc>
+          <w:tcPr>
+            <w:tcW w:type="dxa" w:w="2400"/>
+            <w:tcBorders>
+              <w:top w:val="none" w:color="FFFFFF" w:sz="0"/>
+              <w:left w:val="none" w:color="FFFFFF" w:sz="0"/>
+              <w:bottom w:val="none" w:color="FFFFFF" w:sz="0"/>
+              <w:right w:val="none" w:color="FFFFFF" w:sz="0"/>
+            </w:tcBorders>
+            <w:shd w:fill="FFFFFF" w:color="auto" w:val="clear"/>
+            <w:tcMar>
+              <w:top w:type="dxa" w:w="40"/>
+              <w:left w:type="dxa" w:w="80"/>
+              <w:bottom w:type="dxa" w:w="40"/>
+              <w:right w:type="dxa" w:w="80"/>
+            </w:tcMar>
+            <w:vAlign w:val="center"/>
+          </w:tcPr>
+          <w:p>
+            <w:pPr>
+              <w:jc w:val="center"/>
+            </w:pPr>
+            <w:r>
+              <w:rPr>
+                <w:rFonts w:ascii="Arial" w:cs="Arial" w:eastAsia="Arial" w:hAnsi="Arial"/>
+                <w:b w:val="false"/>
+                <w:bCs w:val="false"/>
+                <w:color w:val="6B6B6B"/>
+                <w:sz w:val="16"/>
+                <w:szCs w:val="16"/>
+              </w:rPr>
               <w:t xml:space="preserve">Lower than 80% of peers</w:t>
             </w:r>
           </w:p>
@@ -1247,7 +1673,7 @@
               <w:bottom w:val="none" w:color="FFFFFF" w:sz="0"/>
               <w:right w:val="none" w:color="FFFFFF" w:sz="0"/>
             </w:tcBorders>
-            <w:shd w:fill="FAF3E0" w:color="auto" w:val="clear"/>
+            <w:shd w:fill="FFFFFF" w:color="auto" w:val="clear"/>
             <w:tcMar>
               <w:top w:type="dxa" w:w="40"/>
               <w:left w:type="dxa" w:w="80"/>
@@ -1328,6 +1754,56 @@
           <w:szCs w:val="17"/>
         </w:rPr>
         <w:t xml:space="preserve">The 2/7/2026 scan did not include segmental analysis, so ALST Index, VFA, and Shape Score have no prior comparison point — they are newly established at this rescan and become the tracking baseline going forward: ALST Index 5.85 kg/m² (Not At-Risk), VFA 61.4 cm² (Low Risk), Shape Score 98/100 (Excellent), BMI 18.9.</w:t>
+      </w:r>
+    </w:p>
+    <w:p>
+      <w:pPr>
+        <w:spacing w:after="100"/>
+      </w:pPr>
+      <w:r>
+        <w:rPr>
+          <w:rFonts w:ascii="Arial" w:cs="Arial" w:eastAsia="Arial" w:hAnsi="Arial"/>
+          <w:b/>
+          <w:bCs/>
+          <w:color w:val="1565C0"/>
+          <w:sz w:val="17"/>
+          <w:szCs w:val="17"/>
+        </w:rPr>
+        <w:t xml:space="preserve">Waist &amp; Silhouette:  </w:t>
+      </w:r>
+      <w:r>
+        <w:rPr>
+          <w:rFonts w:ascii="Arial" w:cs="Arial" w:eastAsia="Arial" w:hAnsi="Arial"/>
+          <w:color w:val="2C2C2C"/>
+          <w:sz w:val="17"/>
+          <w:szCs w:val="17"/>
+        </w:rPr>
+        <w:t xml:space="preserve">Abdominal waist dropped 2.5 in (29.9→27.4) and narrowest waist dropped 3.5 in (29.6→26.1) — the visible shape change behind the recomposition above. Lower waist held essentially flat (29.4→29.4), suggesting the change is concentrated through the upper abdomen and natural waist rather than spread evenly. This is the "tall, open, sculpted" silhouette the ICONS system targets, not just a scale number.</w:t>
+      </w:r>
+    </w:p>
+    <w:p>
+      <w:pPr>
+        <w:spacing w:after="100"/>
+      </w:pPr>
+      <w:r>
+        <w:rPr>
+          <w:rFonts w:ascii="Arial" w:cs="Arial" w:eastAsia="Arial" w:hAnsi="Arial"/>
+          <w:b/>
+          <w:bCs/>
+          <w:color w:val="E65100"/>
+          <w:sz w:val="17"/>
+          <w:szCs w:val="17"/>
+        </w:rPr>
+        <w:t xml:space="preserve">Bone Mass — Not the Same as Clinical Bone Density:  </w:t>
+      </w:r>
+      <w:r>
+        <w:rPr>
+          <w:rFonts w:ascii="Arial" w:cs="Arial" w:eastAsia="Arial" w:hAnsi="Arial"/>
+          <w:color w:val="2C2C2C"/>
+          <w:sz w:val="17"/>
+          <w:szCs w:val="17"/>
+        </w:rPr>
+        <w:t xml:space="preserve">Bone Mass rose 4.2→4.5 lbs (+0.3 lbs) while holding steady at 4.0% of total mass. This is Styku's soft-tissue-derived estimate, not a DEXA bone density scan or T-score — worth being precise about with Elizabeth so the gain isn't overstated. At 64 and postmenopausal, a true DEXA scan would be the next step to confirm bone density directly and screen LIFTMOR-protocol candidacy (T-score &lt; -1.0) if she wants to pursue it.</w:t>
       </w:r>
     </w:p>
     <w:p>

</xml_diff>